<commit_message>
feat: styled default templates with a chronological experience plan
Ship styled docxtpl example templates (centered name and contact line, ruled
headings, bold role lines with right-tab dates, bulleted achievements, a letter
sign-off) and the pipeline conventions they rely on: the contact unit is two
lines and the render context exposes contact_name and contact_details; an
experience unit separates the role from its dates with a tab and units expose
head and tail; the factual check accepts each line of a multi-line unit. The
planner orders a résumé's experience section reverse-chronologically with each
role's achievements under it, and never cuts the contact line or a role that
still has achievements for the page budget.
</commit_message>
<xml_diff>
--- a/examples/applicant/templates/cover-letter/template.docx
+++ b/examples/applicant/templates/cover-letter/template.docx
@@ -3,43 +3,80 @@
 <w:document xmlns:wpc="http://schemas.microsoft.com/office/word/2010/wordprocessingCanvas" xmlns:mo="http://schemas.microsoft.com/office/mac/office/2008/main" xmlns:mc="http://schemas.openxmlformats.org/markup-compatibility/2006" xmlns:mv="urn:schemas-microsoft-com:mac:vml" xmlns:o="urn:schemas-microsoft-com:office:office" xmlns:r="http://schemas.openxmlformats.org/officeDocument/2006/relationships" xmlns:m="http://schemas.openxmlformats.org/officeDocument/2006/math" xmlns:v="urn:schemas-microsoft-com:vml" xmlns:wp14="http://schemas.microsoft.com/office/word/2010/wordprocessingDrawing" xmlns:wp="http://schemas.openxmlformats.org/drawingml/2006/wordprocessingDrawing" xmlns:w10="urn:schemas-microsoft-com:office:word" xmlns:w="http://schemas.openxmlformats.org/wordprocessingml/2006/main" xmlns:w14="http://schemas.microsoft.com/office/word/2010/wordml" xmlns:wpg="http://schemas.microsoft.com/office/word/2010/wordprocessingGroup" xmlns:wpi="http://schemas.microsoft.com/office/word/2010/wordprocessingInk" xmlns:wne="http://schemas.microsoft.com/office/word/2006/wordml" xmlns:wps="http://schemas.microsoft.com/office/word/2010/wordprocessingShape" mc:Ignorable="w14 wp14">
   <w:body>
     <w:p>
+      <w:pPr>
+        <w:spacing w:after="40"/>
+        <w:jc w:val="center"/>
+      </w:pPr>
       <w:r>
-        <w:t>{{ contact }}</w:t>
+        <w:rPr>
+          <w:b/>
+          <w:sz w:val="40"/>
+        </w:rPr>
+        <w:t xml:space="preserve">{{ contact_name }}</w:t>
+      </w:r>
+    </w:p>
+    <w:p>
+      <w:pPr>
+        <w:spacing w:after="320"/>
+        <w:jc w:val="center"/>
+      </w:pPr>
+      <w:r>
+        <w:t xml:space="preserve">{{ contact_details }}</w:t>
       </w:r>
     </w:p>
     <w:p>
       <w:r>
-        <w:t>{%p for section in sections %}</w:t>
+        <w:t xml:space="preserve">{%p for section in sections %}</w:t>
       </w:r>
     </w:p>
     <w:p>
       <w:r>
-        <w:t>{{ section.title }}</w:t>
+        <w:t xml:space="preserve">{%p for unit in section.units %}</w:t>
+      </w:r>
+    </w:p>
+    <w:p>
+      <w:pPr>
+        <w:spacing w:after="160"/>
+      </w:pPr>
+      <w:r>
+        <w:rPr>
+          <w:sz w:val="22"/>
+        </w:rPr>
+        <w:t xml:space="preserve">{{ unit.text }}</w:t>
       </w:r>
     </w:p>
     <w:p>
       <w:r>
-        <w:t>{%p for unit in section.units %}</w:t>
+        <w:t xml:space="preserve">{%p endfor %}</w:t>
       </w:r>
     </w:p>
     <w:p>
       <w:r>
-        <w:t>{{ unit.text }}</w:t>
+        <w:t xml:space="preserve">{%p endfor %}</w:t>
+      </w:r>
+    </w:p>
+    <w:p>
+      <w:pPr>
+        <w:spacing w:before="40" w:after="280"/>
+      </w:pPr>
+      <w:r>
+        <w:rPr>
+          <w:sz w:val="22"/>
+        </w:rPr>
+        <w:t xml:space="preserve">Sincerely,</w:t>
       </w:r>
     </w:p>
     <w:p>
       <w:r>
-        <w:t>{%p endfor %}</w:t>
-      </w:r>
-    </w:p>
-    <w:p>
-      <w:r>
-        <w:t>{%p endfor %}</w:t>
+        <w:rPr>
+          <w:sz w:val="22"/>
+        </w:rPr>
+        <w:t xml:space="preserve">{{ contact_name }}</w:t>
       </w:r>
     </w:p>
     <w:sectPr>
       <w:pgSz w:w="12240" w:h="15840"/>
-      <w:pgMar w:top="1440" w:right="1800" w:bottom="1440" w:left="1800" w:header="720" w:footer="720" w:gutter="0"/>
+      <w:pgMar w:top="1008" w:right="1008" w:bottom="1008" w:left="1008" w:header="720" w:footer="720" w:gutter="0"/>
       <w:cols w:space="720"/>
       <w:docGrid w:linePitch="360"/>
     </w:sectPr>
@@ -410,6 +447,14 @@
     <w:name w:val="Normal"/>
     <w:qFormat/>
     <w:rsid w:val="00FC693F"/>
+    <w:pPr>
+      <w:spacing w:before="0" w:after="0" w:line="240" w:lineRule="auto"/>
+    </w:pPr>
+    <w:rPr>
+      <w:rFonts w:ascii="Calibri" w:hAnsi="Calibri" w:eastAsia="Calibri"/>
+      <w:color w:val="1F1F1F"/>
+      <w:sz w:val="21"/>
+    </w:rPr>
   </w:style>
   <w:style w:type="paragraph" w:styleId="Header">
     <w:name w:val="header"/>

</xml_diff>